<commit_message>
Added verson 2.0.0  by( @Aadiwrth)
</commit_message>
<xml_diff>
--- a/quick_convert_data/docx/another_script.docx
+++ b/quick_convert_data/docx/another_script.docx
@@ -45,21 +45,14 @@
           <w:color w:val="678cd1"/>
           <w:highlight w:val="none"/>
         </w:rPr>
-        <w:t xml:space="preserve">ellen (#</w:t>
+        <w:t xml:space="preserve">ellen</w:t>
       </w:r>
       <w:r>
         <w:rPr>
           <w:color w:val="678cd1"/>
           <w:highlight w:val="none"/>
         </w:rPr>
-        <w:t xml:space="preserve">678CD1</w:t>
-      </w:r>
-      <w:r>
-        <w:rPr>
-          <w:color w:val="678cd1"/>
-          <w:highlight w:val="none"/>
-        </w:rPr>
-        <w:t xml:space="preserve">) </w:t>
+        <w:t xml:space="preserve"> </w:t>
       </w:r>
       <w:r>
         <w:rPr>
@@ -70,7 +63,6 @@
       </w:r>
       <w:r>
         <w:rPr>
-          <w:color w:val="4472c4" w:themeColor="accent5"/>
           <w:highlight w:val="none"/>
         </w:rPr>
       </w:r>
@@ -104,41 +96,6 @@
       </w:r>
       <w:r>
         <w:rPr>
-          <w:color w:val="c77850"/>
-          <w:highlight w:val="none"/>
-        </w:rPr>
-      </w:r>
-      <w:r>
-        <w:rPr>
-          <w:color w:val="auto"/>
-          <w:highlight w:val="none"/>
-        </w:rPr>
-      </w:r>
-      <w:r>
-        <w:rPr>
-          <w:color w:val="c77850"/>
-          <w:highlight w:val="none"/>
-        </w:rPr>
-        <w:t xml:space="preserve">(#</w:t>
-      </w:r>
-      <w:r>
-        <w:rPr>
-          <w:color w:val="c77850"/>
-          <w:highlight w:val="none"/>
-        </w:rPr>
-        <w:t xml:space="preserve">C77850</w:t>
-      </w:r>
-      <w:r>
-        <w:rPr>
-          <w:color w:val="c77850"/>
-          <w:highlight w:val="none"/>
-        </w:rPr>
-        <w:t xml:space="preserve">)</w:t>
-      </w:r>
-      <w:r/>
-      <w:r>
-        <w:rPr>
-          <w:color w:val="c77850"/>
           <w:highlight w:val="none"/>
         </w:rPr>
       </w:r>
@@ -166,6 +123,7 @@
       </w:r>
       <w:r>
         <w:rPr>
+          <w:color w:val="4472c4" w:themeColor="accent5"/>
           <w:highlight w:val="none"/>
         </w:rPr>
       </w:r>
@@ -444,24 +402,6 @@
           <w:highlight w:val="none"/>
         </w:rPr>
         <w:t xml:space="preserve">E: what will you choose ?</w:t>
-      </w:r>
-      <w:r>
-        <w:rPr>
-          <w:color w:val="auto"/>
-          <w:highlight w:val="none"/>
-        </w:rPr>
-      </w:r>
-      <w:r>
-        <w:rPr>
-          <w:color w:val="auto"/>
-          <w:highlight w:val="none"/>
-        </w:rPr>
-      </w:r>
-      <w:r>
-        <w:rPr>
-          <w:color w:val="auto"/>
-          <w:highlight w:val="none"/>
-        </w:rPr>
       </w:r>
       <w:r>
         <w:rPr>

</xml_diff>